<commit_message>
AP Structures app: no slashes in frames or hints; first option stands, alternatives in brackets (fr, it, es, English); IGCSE guide; restamped
Co-Authored-By: Claude Sonnet 5.5 <noreply@anthropic.com>
Claude-Session: https://claude.ai/code/session_01S5rYTdm2Guhk5rucFAEyLg
</commit_message>
<xml_diff>
--- a/Word documents/Eton_IGCSE_User_Guide.docx
+++ b/Word documents/Eton_IGCSE_User_Guide.docx
@@ -20504,6 +20504,21 @@
           <w:szCs w:val="22"/>
         </w:rPr>
         <w:t xml:space="preserve"> and offers three boxes.</w:t>
+      </w:r>
+    </w:p>
+    <w:p>
+      <w:pPr>
+        <w:spacing w:after="120" w:line="276"/>
+      </w:pPr>
+      <w:r>
+        <w:rPr>
+          <w:rFonts w:ascii="Arial" w:cs="Arial" w:eastAsia="Arial" w:hAnsi="Arial"/>
+          <w:b w:val="0"/>
+          <w:bCs/>
+          <w:sz w:val="22"/>
+          <w:szCs w:val="22"/>
+        </w:rPr>
+        <w:t>Where a structure can be said in more than one way, the first way is the one to learn and say; the others follow in brackets.</w:t>
       </w:r>
     </w:p>
     <w:tbl>

</xml_diff>

<commit_message>
IGCSE vocab: Essential / Important / Recognition tiers (20 + 25 per list), chips, lock, View & Print badges and Group by Tier
Co-Authored-By: Claude Sonnet 5.5 <noreply@anthropic.com>
Claude-Session: https://claude.ai/code/session_01PyR4m9qw3VZiECsMbL7sBu
</commit_message>
<xml_diff>
--- a/Word documents/Eton_IGCSE_User_Guide.docx
+++ b/Word documents/Eton_IGCSE_User_Guide.docx
@@ -16448,7 +16448,7 @@
           <w:sz w:val="22"/>
           <w:szCs w:val="22"/>
         </w:rPr>
-        <w:t xml:space="preserve"> chips (Easy, Medium, Hard), Cards per session and Timer.</w:t>
+        <w:t xml:space="preserve"> chips (Easy, Medium, Hard), Importance chips (Essential, Important, Recognition), Cards per session and Timer.</w:t>
       </w:r>
     </w:p>
     <w:p>
@@ -16476,7 +16476,7 @@
           <w:sz w:val="22"/>
           <w:szCs w:val="22"/>
         </w:rPr>
-        <w:t xml:space="preserve"> lets you tick any lists and mix them. It has a language picker, Level tick boxes, and ready-made sets </w:t>
+        <w:t xml:space="preserve"> lets you tick any lists and mix them. It has a language picker, Level and Importance buttons, and ready-made sets </w:t>
       </w:r>
       <w:r>
         <w:rPr>
@@ -16549,6 +16549,162 @@
           <w:szCs w:val="22"/>
         </w:rPr>
         <w:t xml:space="preserve">.</w:t>
+      </w:r>
+    </w:p>
+    <w:p>
+      <w:pPr>
+        <w:pStyle w:val="ListParagraph"/>
+        <w:numPr>
+          <w:ilvl w:val="0"/>
+          <w:numId w:val="2"/>
+        </w:numPr>
+        <w:spacing w:after="60" w:line="276"/>
+      </w:pPr>
+      <w:r>
+        <w:rPr>
+          <w:b/>
+        </w:rPr>
+        <w:t>Importance</w:t>
+      </w:r>
+      <w:r>
+        <w:t xml:space="preserve"> (on the home screen, in </w:t>
+      </w:r>
+      <w:r>
+        <w:rPr>
+          <w:b/>
+        </w:rPr>
+        <w:t>📚 Choose lists</w:t>
+      </w:r>
+      <w:r>
+        <w:t xml:space="preserve"> and in </w:t>
+      </w:r>
+      <w:r>
+        <w:rPr>
+          <w:b/>
+        </w:rPr>
+        <w:t>📖 View</w:t>
+      </w:r>
+      <w:r>
+        <w:t xml:space="preserve">): this tells you which words matter most to say or write in the IGCSE. </w:t>
+      </w:r>
+      <w:r>
+        <w:rPr>
+          <w:b/>
+        </w:rPr>
+        <w:t>Essential</w:t>
+      </w:r>
+      <w:r>
+        <w:t xml:space="preserve"> is the words to learn and be able to produce (about 20 in each list of about 90). </w:t>
+      </w:r>
+      <w:r>
+        <w:rPr>
+          <w:b/>
+        </w:rPr>
+        <w:t>Important</w:t>
+      </w:r>
+      <w:r>
+        <w:t xml:space="preserve"> is the next 25. </w:t>
+      </w:r>
+      <w:r>
+        <w:rPr>
+          <w:b/>
+        </w:rPr>
+        <w:t>Recognition</w:t>
+      </w:r>
+      <w:r>
+        <w:t xml:space="preserve"> is the rest: you need to understand them when you read or hear them. Choose Essential, Important, Essential + Important, Recognition or All words, and the drill, tests, Speed Challenge, View and Print all use just those words. It is separate from Level (Easy, Medium, Hard), which is about how hard a word is to remember; Importance is only about how useful it is to produce. The core lists (IGCSE Nouns, Verbs, Adjectives, Prep/Conj/Adv) are not graded and always stay in. The choice is forgotten when you close the page.</w:t>
+      </w:r>
+    </w:p>
+    <w:p>
+      <w:pPr>
+        <w:pStyle w:val="ListParagraph"/>
+        <w:numPr>
+          <w:ilvl w:val="0"/>
+          <w:numId w:val="2"/>
+        </w:numPr>
+        <w:spacing w:after="60" w:line="276"/>
+      </w:pPr>
+      <w:r>
+        <w:rPr>
+          <w:b/>
+        </w:rPr>
+        <w:t>Recognition is target language → English.</w:t>
+      </w:r>
+      <w:r>
+        <w:t xml:space="preserve"> When you choose Recognition the direction is set that way and ⇄ Swap will not turn it round. The button </w:t>
+      </w:r>
+      <w:r>
+        <w:rPr>
+          <w:b/>
+        </w:rPr>
+        <w:t>🔒 Target language → English only</w:t>
+      </w:r>
+      <w:r>
+        <w:t xml:space="preserve"> turns that lock off (it then says </w:t>
+      </w:r>
+      <w:r>
+        <w:rPr>
+          <w:b/>
+        </w:rPr>
+        <w:t>🔓 Either direction</w:t>
+      </w:r>
+      <w:r>
+        <w:t>); press it again to lock. The Speed Challenge keeps its own direction buttons.</w:t>
+      </w:r>
+    </w:p>
+    <w:p>
+      <w:pPr>
+        <w:pStyle w:val="ListParagraph"/>
+        <w:numPr>
+          <w:ilvl w:val="0"/>
+          <w:numId w:val="2"/>
+        </w:numPr>
+        <w:spacing w:after="60" w:line="276"/>
+      </w:pPr>
+      <w:r>
+        <w:rPr>
+          <w:b/>
+        </w:rPr>
+        <w:t>View and Print:</w:t>
+      </w:r>
+      <w:r>
+        <w:t xml:space="preserve"> every word has an </w:t>
+      </w:r>
+      <w:r>
+        <w:rPr>
+          <w:b/>
+        </w:rPr>
+        <w:t>E</w:t>
+      </w:r>
+      <w:r>
+        <w:t xml:space="preserve">, </w:t>
+      </w:r>
+      <w:r>
+        <w:rPr>
+          <w:b/>
+        </w:rPr>
+        <w:t>I</w:t>
+      </w:r>
+      <w:r>
+        <w:t xml:space="preserve"> or </w:t>
+      </w:r>
+      <w:r>
+        <w:rPr>
+          <w:b/>
+        </w:rPr>
+        <w:t>R</w:t>
+      </w:r>
+      <w:r>
+        <w:t xml:space="preserve"> badge. </w:t>
+      </w:r>
+      <w:r>
+        <w:rPr>
+          <w:b/>
+        </w:rPr>
+        <w:t>Group by</w:t>
+      </w:r>
+      <w:r>
+        <w:t xml:space="preserve"> List keeps one block per list (so you can print one week); Tier puts all the chosen words in Essential, Important and Recognition blocks, ready to print as one sheet.</w:t>
       </w:r>
     </w:p>
     <w:p>

</xml_diff>

<commit_message>
French verbs: F Michaelmas Trials, E Block Michaelmas Trials, F Block Summer Trials and E Block Summer Trials verb sets (all Quizlet verbs, limited tenses, tiers sortable); guide updated
Co-Authored-By: Claude Sonnet 5.5 <noreply@anthropic.com>
Claude-Session: https://claude.ai/code/session_01PyR4m9qw3VZiECsMbL7sBu
</commit_message>
<xml_diff>
--- a/Word documents/Eton_IGCSE_User_Guide.docx
+++ b/Word documents/Eton_IGCSE_User_Guide.docx
@@ -10854,6 +10854,76 @@
     </w:p>
     <w:p>
       <w:pPr>
+        <w:pStyle w:val="ListParagraph"/>
+        <w:numPr>
+          <w:ilvl w:val="0"/>
+          <w:numId w:val="2"/>
+        </w:numPr>
+        <w:spacing w:after="60" w:line="276"/>
+      </w:pPr>
+      <w:r>
+        <w:rPr>
+          <w:b/>
+        </w:rPr>
+        <w:t>🏅 F Michaelmas Trials:</w:t>
+      </w:r>
+      <w:r>
+        <w:rPr/>
+        <w:t xml:space="preserve"> all the Quizlet verbs, for the Michaelmas trials. Only three tenses are offered: Infinitive, Present and Perfect, and the Perfect has only the verbs that take avoir.</w:t>
+      </w:r>
+    </w:p>
+    <w:p>
+      <w:pPr>
+        <w:pStyle w:val="ListParagraph"/>
+        <w:numPr>
+          <w:ilvl w:val="0"/>
+          <w:numId w:val="2"/>
+        </w:numPr>
+        <w:spacing w:after="60" w:line="276"/>
+      </w:pPr>
+      <w:r>
+        <w:rPr>
+          <w:b/>
+        </w:rPr>
+        <w:t>🏅 E Block Michaelmas Trials:</w:t>
+      </w:r>
+      <w:r>
+        <w:rPr/>
+        <w:t xml:space="preserve"> all the Quizlet verbs, with Infinitive, Present, Perfect (every verb, including être and reflexive verbs), Imperfect and Future.</w:t>
+      </w:r>
+    </w:p>
+    <w:p>
+      <w:pPr>
+        <w:pStyle w:val="ListParagraph"/>
+        <w:numPr>
+          <w:ilvl w:val="0"/>
+          <w:numId w:val="2"/>
+        </w:numPr>
+        <w:spacing w:after="60" w:line="276"/>
+      </w:pPr>
+      <w:r>
+        <w:rPr>
+          <w:b/>
+        </w:rPr>
+        <w:t>🏅 F Block Summer Trials</w:t>
+      </w:r>
+      <w:r>
+        <w:rPr/>
+        <w:t xml:space="preserve"> and </w:t>
+      </w:r>
+      <w:r>
+        <w:rPr>
+          <w:b/>
+        </w:rPr>
+        <w:t>🏅 E Block Summer Trials:</w:t>
+      </w:r>
+      <w:r>
+        <w:rPr/>
+        <w:t xml:space="preserve"> the same verbs and tenses as E Block Michaelmas Trials.</w:t>
+      </w:r>
+    </w:p>
+    <w:p>
+      <w:pPr>
         <w:spacing w:after="120" w:line="276"/>
       </w:pPr>
       <w:r>
@@ -10863,6 +10933,9 @@
           <w:szCs w:val="22"/>
         </w:rPr>
         <w:t>Use Specialist and Top Structures when Eton tells you to.</w:t>
+      </w:r>
+      <w:r>
+        <w:t xml:space="preserve"> The Importance buttons (Essential, Important, Useful) work inside these four sets too, so you can sort the trials verbs by importance, and 📖 View &amp; Print can group them by tier.</w:t>
       </w:r>
     </w:p>
     <w:p>

</xml_diff>

<commit_message>
Mix both ways in Approved Material Practice Sentences, plus IGCSE guide
Adds Off / 50-50 / 70-30 under Direction for both Approved Material and
Practice Sentences (drill, Leisure Mode, tests, Spot Tests, Speed Challenge,
set links). The Speed Challenge banner on Practice Sentences now carries the
main-screen direction, sections, topics and Mix into the game, using the
Practice Sentences data. IGCSE user guide (HTML and Word) updated.

Co-Authored-By: Claude Sonnet 5.5 <noreply@anthropic.com>
Claude-Session: https://claude.ai/code/session_012CWWZC1fgkCrSzUumCoAHh
</commit_message>
<xml_diff>
--- a/Word documents/Eton_IGCSE_User_Guide.docx
+++ b/Word documents/Eton_IGCSE_User_Guide.docx
@@ -19016,6 +19016,26 @@
           <w:szCs w:val="22"/>
         </w:rPr>
         <w:t xml:space="preserve">).</w:t>
+      </w:r>
+    </w:p>
+    <w:p>
+      <w:pPr>
+        <w:pStyle w:val="ListParagraph"/>
+        <w:numPr>
+          <w:ilvl w:val="0"/>
+          <w:numId w:val="11"/>
+        </w:numPr>
+        <w:spacing w:after="70" w:line="276"/>
+      </w:pPr>
+      <w:r>
+        <w:rPr>
+          <w:rFonts w:ascii="Arial" w:cs="Arial" w:eastAsia="Arial" w:hAnsi="Arial"/>
+          <w:b w:val="0"/>
+          <w:bCs/>
+          <w:sz w:val="22"/>
+          <w:szCs w:val="22"/>
+        </w:rPr>
+        <w:t>Mix both ways (under Direction): Off, 50–50 or 70–30. With 70–30, seven in ten cards go from English into the language and three in ten back into English; each card shows its own direction. It works in the drill, Leisure Mode, tests, Spot Tests and the Speed Challenge, for both Approved Material and Practice Sentences, and starts as Off each time.</w:t>
       </w:r>
     </w:p>
     <w:p>

</xml_diff>

<commit_message>
Approved Material: label sentence tiles "Translate only the bold"
Speed Challenge sentence tiles now carry a blue "Translate only the bold"
label so the task is clear on the tile itself; the Spot Test tag now reads
TRANSLATE ONLY THE BOLD to match. IGCSE user guide (HTML and Word) updated.

Co-Authored-By: Claude Sonnet 5.5 <noreply@anthropic.com>
Claude-Session: https://claude.ai/code/session_014gLWoGGRd9x2h9RHd6gB7b
</commit_message>
<xml_diff>
--- a/Word documents/Eton_IGCSE_User_Guide.docx
+++ b/Word documents/Eton_IGCSE_User_Guide.docx
@@ -20789,7 +20789,7 @@
           <w:sz w:val="22"/>
           <w:szCs w:val="22"/>
         </w:rPr>
-        <w:t xml:space="preserve">; your level is printed in big letters at the top of your PDF, and Mixed is right unless your teacher has told you otherwise. The items come from the approved sentences of that section and are fitted to about 4½ minutes. Each item carries a tag saying what to do (for example CORRECT THE GRAMMAR ERROR or TRANSLATE THE BOLD WORDS). Write your answers, submit, and your teacher marks it like every other Eton Spot Test. This is the only place in the Studio where you are marked.</w:t>
+        <w:t xml:space="preserve">; your level is printed in big letters at the top of your PDF, and Mixed is right unless your teacher has told you otherwise. The items come from the approved sentences of that section and are fitted to about 4½ minutes. Each item carries a tag saying what to do (for example CORRECT THE GRAMMAR ERROR or TRANSLATE ONLY THE BOLD). Write your answers, submit, and your teacher marks it like every other Eton Spot Test. This is the only place in the Studio where you are marked.</w:t>
       </w:r>
     </w:p>
     <w:p>
@@ -20891,7 +20891,7 @@
           <w:sz w:val="22"/>
           <w:szCs w:val="22"/>
         </w:rPr>
-        <w:t xml:space="preserve"> the same tile game as the vocabulary apps, fed from the Approved Material. Press ⚡ Eton Speed Challenge on the main page (or ⚡ Speed inside the Studio). From the main page it opens on what the home screen shows: the direction (English → language or language → English), the sections and the topics you have ticked, as the approved sentences. In Phrases, a short bit is shown inside its whole sentence with the part to translate in bold, so there is always enough context; say just the bold part, and the answer shows it in the whole sentence. Where French, Italian or Spanish uses a different verb from English, a bracket gives the verb to use, for example (doing) cycling for faire du vélo or (weather) it’s hot for il fait chaud. The same brackets appear in the Studio’s short translations and bold bits. Choose the language, then Phrases (the key words and phrases, the short translations and the bold bits) or Sentences (the approved sentences), and the sections you want. The game's own test buttons are hidden here: tests are set from the Studio.</w:t>
+        <w:t xml:space="preserve"> the same tile game as the vocabulary apps, fed from the Approved Material. Press ⚡ Eton Speed Challenge on the main page (or ⚡ Speed inside the Studio). From the main page it opens on what the home screen shows: the direction (English → language or language → English), the sections and the topics you have ticked, as the approved sentences. In Phrases, a short bit is shown inside its whole sentence with the part to translate in bold and a small blue label under it saying TRANSLATE ONLY THE BOLD, so there is always enough context; say just the bold part, and the answer shows it in the whole sentence. Where French, Italian or Spanish uses a different verb from English, a bracket gives the verb to use, for example (doing) cycling for faire du vélo or (weather) it’s hot for il fait chaud. The same brackets appear in the Studio’s short translations and bold bits. Choose the language, then Phrases (the key words and phrases, the short translations and the bold bits) or Sentences (the approved sentences), and the sections you want. The game's own test buttons are hidden here: tests are set from the Studio.</w:t>
       </w:r>
     </w:p>
     <w:p>

</xml_diff>